<commit_message>
docs: atualiza documento textual do TCC2 (DOCX)
Co-Authored-By: Claude Opus 4.8 (1M context) <noreply@anthropic.com>
</commit_message>
<xml_diff>
--- a/TCC2_MARCOS_STINGHER.docx
+++ b/TCC2_MARCOS_STINGHER.docx
@@ -1,6 +1,6 @@
 
 <file path=word/document.xml><?xml version="1.0" encoding="utf-8"?>
-<w:document xmlns:wpc="http://schemas.microsoft.com/office/word/2010/wordprocessingCanvas" xmlns:cx="http://schemas.microsoft.com/office/drawing/2014/chartex" xmlns:cx1="http://schemas.microsoft.com/office/drawing/2015/9/8/chartex" xmlns:cx2="http://schemas.microsoft.com/office/drawing/2015/10/21/chartex" xmlns:cx3="http://schemas.microsoft.com/office/drawing/2016/5/9/chartex" xmlns:cx4="http://schemas.microsoft.com/office/drawing/2016/5/10/chartex" xmlns:cx5="http://schemas.microsoft.com/office/drawing/2016/5/11/chartex" xmlns:cx6="http://schemas.microsoft.com/office/drawing/2016/5/12/chartex" xmlns:cx7="http://schemas.microsoft.com/office/drawing/2016/5/13/chartex" xmlns:cx8="http://schemas.microsoft.com/office/drawing/2016/5/14/chartex" xmlns:mc="http://schemas.openxmlformats.org/markup-compatibility/2006" xmlns:aink="http://schemas.microsoft.com/office/drawing/2016/ink" xmlns:am3d="http://schemas.microsoft.com/office/drawing/2017/model3d" xmlns:o="urn:schemas-microsoft-com:office:office" xmlns:r="http://schemas.openxmlformats.org/officeDocument/2006/relationships" xmlns:m="http://schemas.openxmlformats.org/officeDocument/2006/math" xmlns:v="urn:schemas-microsoft-com:vml" xmlns:wp14="http://schemas.microsoft.com/office/word/2010/wordprocessingDrawing" xmlns:wp="http://schemas.openxmlformats.org/drawingml/2006/wordprocessingDrawing" xmlns:w10="urn:schemas-microsoft-com:office:word" xmlns:w="http://schemas.openxmlformats.org/wordprocessingml/2006/main" xmlns:w14="http://schemas.microsoft.com/office/word/2010/wordml" xmlns:w15="http://schemas.microsoft.com/office/word/2012/wordml" xmlns:w16cex="http://schemas.microsoft.com/office/word/2018/wordml/cex" xmlns:w16cid="http://schemas.microsoft.com/office/word/2016/wordml/cid" xmlns:w16="http://schemas.microsoft.com/office/word/2018/wordml" xmlns:w16sdtdh="http://schemas.microsoft.com/office/word/2020/wordml/sdtdatahash" xmlns:w16se="http://schemas.microsoft.com/office/word/2015/wordml/symex" xmlns:wpg="http://schemas.microsoft.com/office/word/2010/wordprocessingGroup" xmlns:wpi="http://schemas.microsoft.com/office/word/2010/wordprocessingInk" xmlns:wne="http://schemas.microsoft.com/office/word/2006/wordml" xmlns:wps="http://schemas.microsoft.com/office/word/2010/wordprocessingShape" mc:Ignorable="w14 w15 w16se w16cid w16 w16cex w16sdtdh wp14">
+<w:document xmlns:wpc="http://schemas.microsoft.com/office/word/2010/wordprocessingCanvas" xmlns:cx="http://schemas.microsoft.com/office/drawing/2014/chartex" xmlns:cx1="http://schemas.microsoft.com/office/drawing/2015/9/8/chartex" xmlns:cx2="http://schemas.microsoft.com/office/drawing/2015/10/21/chartex" xmlns:cx3="http://schemas.microsoft.com/office/drawing/2016/5/9/chartex" xmlns:cx4="http://schemas.microsoft.com/office/drawing/2016/5/10/chartex" xmlns:cx5="http://schemas.microsoft.com/office/drawing/2016/5/11/chartex" xmlns:cx6="http://schemas.microsoft.com/office/drawing/2016/5/12/chartex" xmlns:cx7="http://schemas.microsoft.com/office/drawing/2016/5/13/chartex" xmlns:cx8="http://schemas.microsoft.com/office/drawing/2016/5/14/chartex" xmlns:mc="http://schemas.openxmlformats.org/markup-compatibility/2006" xmlns:aink="http://schemas.microsoft.com/office/drawing/2016/ink" xmlns:am3d="http://schemas.microsoft.com/office/drawing/2017/model3d" xmlns:o="urn:schemas-microsoft-com:office:office" xmlns:oel="http://schemas.microsoft.com/office/2019/extlst" xmlns:r="http://schemas.openxmlformats.org/officeDocument/2006/relationships" xmlns:m="http://schemas.openxmlformats.org/officeDocument/2006/math" xmlns:v="urn:schemas-microsoft-com:vml" xmlns:wp14="http://schemas.microsoft.com/office/word/2010/wordprocessingDrawing" xmlns:wp="http://schemas.openxmlformats.org/drawingml/2006/wordprocessingDrawing" xmlns:w10="urn:schemas-microsoft-com:office:word" xmlns:w="http://schemas.openxmlformats.org/wordprocessingml/2006/main" xmlns:w14="http://schemas.microsoft.com/office/word/2010/wordml" xmlns:w15="http://schemas.microsoft.com/office/word/2012/wordml" xmlns:w16cex="http://schemas.microsoft.com/office/word/2018/wordml/cex" xmlns:w16cid="http://schemas.microsoft.com/office/word/2016/wordml/cid" xmlns:w16="http://schemas.microsoft.com/office/word/2018/wordml" xmlns:w16du="http://schemas.microsoft.com/office/word/2023/wordml/word16du" xmlns:w16sdtdh="http://schemas.microsoft.com/office/word/2020/wordml/sdtdatahash" xmlns:w16sdtfl="http://schemas.microsoft.com/office/word/2024/wordml/sdtformatlock" xmlns:w16se="http://schemas.microsoft.com/office/word/2015/wordml/symex" xmlns:wpg="http://schemas.microsoft.com/office/word/2010/wordprocessingGroup" xmlns:wpi="http://schemas.microsoft.com/office/word/2010/wordprocessingInk" xmlns:wne="http://schemas.microsoft.com/office/word/2006/wordml" xmlns:wps="http://schemas.microsoft.com/office/word/2010/wordprocessingShape" mc:Ignorable="w14 w15 w16se w16cid w16 w16cex w16sdtdh w16sdtfl w16du wp14">
   <w:body>
     <w:p>
       <w:pPr>
@@ -59,13 +59,8 @@
       </w:r>
       <w:proofErr w:type="spellEnd"/>
       <w:r>
-        <w:t xml:space="preserve"> Barbosa </w:t>
-      </w:r>
-      <w:proofErr w:type="spellStart"/>
-      <w:r>
-        <w:t>Stingher</w:t>
-      </w:r>
-      <w:proofErr w:type="spellEnd"/>
+        <w:t xml:space="preserve"> Barbosa Stingher</w:t>
+      </w:r>
       <w:r>
         <w:rPr>
           <w:rStyle w:val="Refdenotaderodap"/>
@@ -2000,13 +1995,7 @@
       </w:r>
       <w:r>
         <w:tab/>
-        <w:t>(continua</w:t>
-      </w:r>
-      <w:r>
-        <w:t>ção</w:t>
-      </w:r>
-      <w:r>
-        <w:t>)</w:t>
+        <w:t>(continuação)</w:t>
       </w:r>
     </w:p>
     <w:tbl>
@@ -5314,6 +5303,15 @@
     </w:tbl>
     <w:p>
       <w:pPr>
+        <w:spacing w:before="120"/>
+        <w:jc w:val="both"/>
+      </w:pPr>
+      <w:r>
+        <w:t>Fonte: Os autores.</w:t>
+      </w:r>
+    </w:p>
+    <w:p>
+      <w:pPr>
         <w:autoSpaceDE w:val="0"/>
         <w:autoSpaceDN w:val="0"/>
         <w:adjustRightInd w:val="0"/>
@@ -5588,6 +5586,7 @@
           <w:b/>
           <w:bCs/>
         </w:rPr>
+        <w:lastRenderedPageBreak/>
         <w:t>D3.js (v7):</w:t>
       </w:r>
       <w:r>
@@ -5633,11 +5632,7 @@
         <w:t xml:space="preserve"> </w:t>
       </w:r>
       <w:r>
-        <w:t xml:space="preserve">que permite </w:t>
-      </w:r>
-      <w:r>
-        <w:lastRenderedPageBreak/>
-        <w:t>a identificação visual de clusters temáticos e a exploração interativa das relações entre termos do corpus.</w:t>
+        <w:t>que permite a identificação visual de clusters temáticos e a exploração interativa das relações entre termos do corpus.</w:t>
       </w:r>
     </w:p>
     <w:p>
@@ -5898,17 +5893,7 @@
           <w:i/>
           <w:iCs/>
         </w:rPr>
-        <w:t>dashboard_uml.html</w:t>
-      </w:r>
-      <w:r>
-        <w:t xml:space="preserve"> e </w:t>
-      </w:r>
-      <w:r>
-        <w:rPr>
-          <w:i/>
-          <w:iCs/>
-        </w:rPr>
-        <w:t>insights_uml.html</w:t>
+        <w:t>dashboard_uml.html, insights_uml.html e resumo_executivo.html</w:t>
       </w:r>
       <w:r>
         <w:t>;</w:t>
@@ -6010,7 +5995,11 @@
         <w:jc w:val="both"/>
       </w:pPr>
       <w:r>
-        <w:t xml:space="preserve">O ano de maior volume foi 2011, com 23 artigos identificados, valor que representa quase o dobro da média anual. Esse pico coincide com a publicação de obras de grande impacto, como o livro de </w:t>
+        <w:t xml:space="preserve">O ano de maior volume foi 2011, com 23 artigos identificados, valor que representa quase o dobro da média anual. Esse pico coincide com a publicação de obras de grande impacto, </w:t>
+      </w:r>
+      <w:r>
+        <w:lastRenderedPageBreak/>
+        <w:t xml:space="preserve">como o livro de </w:t>
       </w:r>
       <w:proofErr w:type="spellStart"/>
       <w:r>
@@ -6044,11 +6033,7 @@
         <w:t xml:space="preserve">concretizaram a relevância </w:t>
       </w:r>
       <w:r>
-        <w:t xml:space="preserve">da </w:t>
-      </w:r>
-      <w:r>
-        <w:lastRenderedPageBreak/>
-        <w:t xml:space="preserve">UML logo após o lançamento da versão 2.x. O segundo pico expressivo ocorreu em 2018, com 21 artigos, impulsionado pela </w:t>
+        <w:t xml:space="preserve">da UML logo após o lançamento da versão 2.x. O segundo pico expressivo ocorreu em 2018, com 21 artigos, impulsionado pela </w:t>
       </w:r>
       <w:r>
         <w:t xml:space="preserve">crescente </w:t>
@@ -6200,35 +6185,39 @@
         <w:t xml:space="preserve"> </w:t>
       </w:r>
       <w:r>
-        <w:t xml:space="preserve">com linha de média móvel e filtros por fase, fonte e </w:t>
-      </w:r>
-      <w:proofErr w:type="spellStart"/>
-      <w:r>
-        <w:t>tipo</w:t>
-      </w:r>
-      <w:proofErr w:type="spellEnd"/>
-      <w:r>
-        <w:t xml:space="preserve"> de publicação</w:t>
+        <w:t>com linha de média móvel e filtros por fase, fonte e tipo de publicação</w:t>
       </w:r>
       <w:r>
         <w:t>.</w:t>
       </w:r>
-      <w:r>
-        <w:t xml:space="preserve"> Este arquivo pode ser visualizado no </w:t>
-      </w:r>
-      <w:proofErr w:type="spellStart"/>
-      <w:r>
-        <w:t>Git</w:t>
-      </w:r>
-      <w:proofErr w:type="spellEnd"/>
-      <w:r>
-        <w:t xml:space="preserve"> deste projeto pelo link </w:t>
-      </w:r>
-      <w:r>
-        <w:rPr>
-          <w:highlight w:val="red"/>
-        </w:rPr>
-        <w:t>https://XXXXXXXXXX</w:t>
+    </w:p>
+    <w:p>
+      <w:pPr>
+        <w:ind w:firstLine="708"/>
+        <w:jc w:val="both"/>
+      </w:pPr>
+      <w:r>
+        <w:t>Este arquivo pode ser visualizado no Git</w:t>
+      </w:r>
+      <w:r>
+        <w:t>Hub</w:t>
+      </w:r>
+      <w:r>
+        <w:t xml:space="preserve"> deste projeto pelo lin</w:t>
+      </w:r>
+      <w:r>
+        <w:t xml:space="preserve">k </w:t>
+      </w:r>
+      <w:hyperlink r:id="rId9" w:history="1">
+        <w:r>
+          <w:rPr>
+            <w:rStyle w:val="Hyperlink"/>
+          </w:rPr>
+          <w:t>https://github.com/MarcosStingher/marcosstingher_tcc2/blob/main/dashboard_uml.html</w:t>
+        </w:r>
+      </w:hyperlink>
+      <w:r>
+        <w:t>.</w:t>
       </w:r>
     </w:p>
     <w:p>
@@ -6302,15 +6291,7 @@
       </w:r>
       <w:proofErr w:type="spellEnd"/>
       <w:r>
-        <w:t xml:space="preserve"> (2011), </w:t>
-      </w:r>
-      <w:proofErr w:type="spellStart"/>
-      <w:r>
-        <w:t>Petre</w:t>
-      </w:r>
-      <w:proofErr w:type="spellEnd"/>
-      <w:r>
-        <w:t xml:space="preserve"> (2013) e </w:t>
+        <w:t xml:space="preserve"> (2011), Petre (2013) e </w:t>
       </w:r>
       <w:proofErr w:type="spellStart"/>
       <w:r>
@@ -6336,6 +6317,7 @@
           <w:b/>
           <w:bCs/>
         </w:rPr>
+        <w:lastRenderedPageBreak/>
         <w:t xml:space="preserve">Fase 2 </w:t>
       </w:r>
       <w:r>
@@ -6393,7 +6375,6 @@
           <w:b/>
           <w:bCs/>
         </w:rPr>
-        <w:lastRenderedPageBreak/>
         <w:t xml:space="preserve">Fase 3 </w:t>
       </w:r>
       <w:r>
@@ -7224,23 +7205,7 @@
                 <w:sz w:val="20"/>
                 <w:szCs w:val="20"/>
               </w:rPr>
-              <w:t>Semântica e notação UML (</w:t>
-            </w:r>
-            <w:proofErr w:type="spellStart"/>
-            <w:r>
-              <w:rPr>
-                <w:sz w:val="20"/>
-                <w:szCs w:val="20"/>
-              </w:rPr>
-              <w:t>Università</w:t>
-            </w:r>
-            <w:proofErr w:type="spellEnd"/>
-            <w:r>
-              <w:rPr>
-                <w:sz w:val="20"/>
-                <w:szCs w:val="20"/>
-              </w:rPr>
-              <w:t xml:space="preserve"> </w:t>
+              <w:t xml:space="preserve">Semântica e notação UML (Università </w:t>
             </w:r>
             <w:proofErr w:type="spellStart"/>
             <w:r>
@@ -7346,23 +7311,7 @@
                 <w:sz w:val="20"/>
                 <w:szCs w:val="20"/>
               </w:rPr>
-              <w:t>Engenharia de software; modelagem e teste (</w:t>
-            </w:r>
-            <w:proofErr w:type="spellStart"/>
-            <w:r>
-              <w:rPr>
-                <w:sz w:val="20"/>
-                <w:szCs w:val="20"/>
-              </w:rPr>
-              <w:t>Università</w:t>
-            </w:r>
-            <w:proofErr w:type="spellEnd"/>
-            <w:r>
-              <w:rPr>
-                <w:sz w:val="20"/>
-                <w:szCs w:val="20"/>
-              </w:rPr>
-              <w:t xml:space="preserve"> </w:t>
+              <w:t xml:space="preserve">Engenharia de software; modelagem e teste (Università </w:t>
             </w:r>
             <w:proofErr w:type="spellStart"/>
             <w:r>
@@ -7722,7 +7671,11 @@
         <w:t>entre 513 autores únicos</w:t>
       </w:r>
       <w:r>
-        <w:t xml:space="preserve">, evidenciando a amplitude e a diversidade da comunidade científica que pesquisa a UML. A concentração de autores com mais de duas publicações é relativamente baixa, sendo um padrão esperado em campos maduros e interdisciplinares, onde cada artigo tende a ser contribuição única de grupos distintos. Michel R. V. </w:t>
+        <w:t xml:space="preserve">, evidenciando a amplitude e a diversidade da comunidade científica que pesquisa a UML. A concentração de autores com mais de duas publicações é relativamente baixa, sendo um padrão </w:t>
+      </w:r>
+      <w:r>
+        <w:lastRenderedPageBreak/>
+        <w:t xml:space="preserve">esperado em campos maduros e interdisciplinares, onde cada artigo tende a ser contribuição única de grupos distintos. Michel R. V. </w:t>
       </w:r>
       <w:proofErr w:type="spellStart"/>
       <w:r>
@@ -7744,11 +7697,7 @@
       </w:r>
       <w:proofErr w:type="spellEnd"/>
       <w:r>
-        <w:t xml:space="preserve"> com quatro, ambos com contribuições em perspectivas complementares: empírica e formal, respectivamente. A </w:t>
-      </w:r>
-      <w:r>
-        <w:lastRenderedPageBreak/>
-        <w:t xml:space="preserve">presença de </w:t>
+        <w:t xml:space="preserve"> com quatro, ambos com contribuições em perspectivas complementares: empírica e formal, respectivamente. A presença de </w:t>
       </w:r>
       <w:proofErr w:type="spellStart"/>
       <w:r>
@@ -8949,6 +8898,7 @@
                 <w:sz w:val="20"/>
                 <w:szCs w:val="20"/>
               </w:rPr>
+              <w:lastRenderedPageBreak/>
               <w:t>4</w:t>
             </w:r>
           </w:p>
@@ -9427,7 +9377,6 @@
                 <w:sz w:val="20"/>
                 <w:szCs w:val="20"/>
               </w:rPr>
-              <w:lastRenderedPageBreak/>
               <w:t>Nº</w:t>
             </w:r>
           </w:p>
@@ -9642,6 +9591,9 @@
               <w:t xml:space="preserve">ICMDE </w:t>
             </w:r>
             <w:r>
+              <w:rPr>
+                <w:lang w:val="en-US"/>
+              </w:rPr>
               <w:t xml:space="preserve">– </w:t>
             </w:r>
             <w:r>
@@ -10388,11 +10340,6 @@
       <w:pPr>
         <w:jc w:val="both"/>
       </w:pPr>
-    </w:p>
-    <w:p>
-      <w:pPr>
-        <w:jc w:val="both"/>
-      </w:pPr>
       <w:r>
         <w:t>4</w:t>
       </w:r>
@@ -10438,23 +10385,7 @@
       <w:pPr>
         <w:jc w:val="both"/>
       </w:pPr>
-    </w:p>
-    <w:p>
-      <w:pPr>
-        <w:jc w:val="both"/>
-      </w:pPr>
-    </w:p>
-    <w:p>
-      <w:pPr>
-        <w:jc w:val="both"/>
-      </w:pPr>
-    </w:p>
-    <w:p>
-      <w:pPr>
-        <w:jc w:val="both"/>
-      </w:pPr>
-      <w:r>
-        <w:lastRenderedPageBreak/>
+      <w:r>
         <w:t xml:space="preserve">Quadro </w:t>
       </w:r>
       <w:r>
@@ -12133,7 +12064,7 @@
                     <pic:cNvPicPr/>
                   </pic:nvPicPr>
                   <pic:blipFill>
-                    <a:blip r:embed="rId9"/>
+                    <a:blip r:embed="rId10"/>
                     <a:stretch>
                       <a:fillRect/>
                     </a:stretch>
@@ -12179,7 +12110,6 @@
         <w:jc w:val="both"/>
       </w:pPr>
       <w:r>
-        <w:lastRenderedPageBreak/>
         <w:t>Uma v</w:t>
       </w:r>
       <w:r>
@@ -12205,24 +12135,59 @@
         <w:t>insights_uml.html</w:t>
       </w:r>
       <w:r>
-        <w:t xml:space="preserve"> no </w:t>
-      </w:r>
-      <w:proofErr w:type="spellStart"/>
-      <w:r>
-        <w:t>Github</w:t>
-      </w:r>
-      <w:proofErr w:type="spellEnd"/>
-      <w:r>
-        <w:t xml:space="preserve">, no endereço </w:t>
-      </w:r>
-      <w:r>
-        <w:rPr>
-          <w:highlight w:val="red"/>
-        </w:rPr>
-        <w:t>https://XXXXXXXXXX</w:t>
-      </w:r>
-      <w:r>
-        <w:t xml:space="preserve"> A Figura 2, apresenta </w:t>
+        <w:t xml:space="preserve"> no</w:t>
+      </w:r>
+      <w:r>
+        <w:rPr>
+          <w:color w:val="FFFFFF" w:themeColor="background1"/>
+        </w:rPr>
+        <w:t>_</w:t>
+      </w:r>
+      <w:proofErr w:type="gramStart"/>
+      <w:r>
+        <w:t>Github,</w:t>
+      </w:r>
+      <w:r>
+        <w:rPr>
+          <w:color w:val="FFFFFF" w:themeColor="background1"/>
+        </w:rPr>
+        <w:t>_</w:t>
+      </w:r>
+      <w:proofErr w:type="gramEnd"/>
+      <w:r>
+        <w:t>no</w:t>
+      </w:r>
+      <w:r>
+        <w:rPr>
+          <w:color w:val="FFFFFF" w:themeColor="background1"/>
+        </w:rPr>
+        <w:t>_</w:t>
+      </w:r>
+      <w:r>
+        <w:t>endereço</w:t>
+      </w:r>
+      <w:r>
+        <w:rPr>
+          <w:color w:val="FFFFFF" w:themeColor="background1"/>
+        </w:rPr>
+        <w:t>_</w:t>
+      </w:r>
+      <w:hyperlink r:id="rId11" w:history="1">
+        <w:r>
+          <w:rPr>
+            <w:rStyle w:val="Hyperlink"/>
+          </w:rPr>
+          <w:t>https://github.com/MarcosStingher/marcosstingher_tcc2/blob/main/insights_uml.html</w:t>
+        </w:r>
+      </w:hyperlink>
+      <w:r>
+        <w:t>.</w:t>
+      </w:r>
+      <w:r>
+        <w:t xml:space="preserve"> </w:t>
+      </w:r>
+      <w:r>
+        <w:t xml:space="preserve">A Figura 2 apresenta </w:t>
       </w:r>
       <w:r>
         <w:t>32 nós</w:t>
@@ -12982,6 +12947,7 @@
         <w:jc w:val="both"/>
       </w:pPr>
       <w:r>
+        <w:lastRenderedPageBreak/>
         <w:t>Tabela "Corpus Completo" com os 207 artigos, colunas redimensionáveis e paginação</w:t>
       </w:r>
       <w:r>
@@ -13126,6 +13092,213 @@
         <w:jc w:val="both"/>
       </w:pPr>
       <w:r>
+        <w:t>O arquivo resumo_executivo.html é o painel de resumo da pesquisa, contendo todos os</w:t>
+      </w:r>
+      <w:r>
+        <w:t xml:space="preserve"> </w:t>
+      </w:r>
+      <w:r>
+        <w:t>principais dados elucidados durante a execução do trabalho:</w:t>
+      </w:r>
+    </w:p>
+    <w:p>
+      <w:pPr>
+        <w:ind w:firstLine="708"/>
+        <w:jc w:val="both"/>
+      </w:pPr>
+    </w:p>
+    <w:p>
+      <w:pPr>
+        <w:pStyle w:val="PargrafodaLista"/>
+        <w:numPr>
+          <w:ilvl w:val="0"/>
+          <w:numId w:val="24"/>
+        </w:numPr>
+        <w:jc w:val="both"/>
+      </w:pPr>
+      <w:r>
+        <w:t>Indicadores-chave (KPIs) em destaque: total de artigos do corpus (207), período</w:t>
+      </w:r>
+      <w:r>
+        <w:t xml:space="preserve"> </w:t>
+      </w:r>
+      <w:r>
+        <w:t xml:space="preserve">analisado (15 anos), autores únicos (513), </w:t>
+      </w:r>
+      <w:proofErr w:type="spellStart"/>
+      <w:r>
+        <w:t>venues</w:t>
+      </w:r>
+      <w:proofErr w:type="spellEnd"/>
+      <w:r>
+        <w:t xml:space="preserve"> distintos (86), média anual de</w:t>
+      </w:r>
+      <w:r>
+        <w:t xml:space="preserve"> </w:t>
+      </w:r>
+      <w:r>
+        <w:t>publicações (13,8) e número de bases consultadas (4);</w:t>
+      </w:r>
+    </w:p>
+    <w:p>
+      <w:pPr>
+        <w:pStyle w:val="PargrafodaLista"/>
+        <w:numPr>
+          <w:ilvl w:val="0"/>
+          <w:numId w:val="24"/>
+        </w:numPr>
+        <w:jc w:val="both"/>
+      </w:pPr>
+      <w:r>
+        <w:t>Distribuição visual do corpus nas três fases analíticas (80, 73 e 54 artigos,</w:t>
+      </w:r>
+      <w:r>
+        <w:t xml:space="preserve"> </w:t>
+      </w:r>
+      <w:r>
+        <w:t>respectivamente);</w:t>
+      </w:r>
+      <w:r>
+        <w:t xml:space="preserve"> </w:t>
+      </w:r>
+    </w:p>
+    <w:p>
+      <w:pPr>
+        <w:pStyle w:val="PargrafodaLista"/>
+        <w:numPr>
+          <w:ilvl w:val="0"/>
+          <w:numId w:val="24"/>
+        </w:numPr>
+        <w:jc w:val="both"/>
+      </w:pPr>
+      <w:r>
+        <w:t>Gráficos resumidos de Publicações por Ano (2010–2024) e de Tipo de</w:t>
+      </w:r>
+      <w:r>
+        <w:t xml:space="preserve"> </w:t>
+      </w:r>
+      <w:r>
+        <w:t>Publicação;</w:t>
+      </w:r>
+    </w:p>
+    <w:p>
+      <w:pPr>
+        <w:pStyle w:val="PargrafodaLista"/>
+        <w:numPr>
+          <w:ilvl w:val="0"/>
+          <w:numId w:val="24"/>
+        </w:numPr>
+        <w:jc w:val="both"/>
+      </w:pPr>
+      <w:r>
+        <w:t>Quadro consolidado das Questões de Pesquisa com as respostas obtidas;</w:t>
+      </w:r>
+    </w:p>
+    <w:p>
+      <w:pPr>
+        <w:pStyle w:val="PargrafodaLista"/>
+        <w:numPr>
+          <w:ilvl w:val="0"/>
+          <w:numId w:val="24"/>
+        </w:numPr>
+        <w:jc w:val="both"/>
+      </w:pPr>
+      <w:r>
+        <w:t>Top 10 Autores Mais Produtivos e Top 10 Periódicos/Conferências;</w:t>
+      </w:r>
+    </w:p>
+    <w:p>
+      <w:pPr>
+        <w:pStyle w:val="PargrafodaLista"/>
+        <w:numPr>
+          <w:ilvl w:val="0"/>
+          <w:numId w:val="24"/>
+        </w:numPr>
+        <w:jc w:val="both"/>
+      </w:pPr>
+      <w:r>
+        <w:t>Cards de Achados e Padrões Principais com sínteses interpretativas do estudo;</w:t>
+      </w:r>
+    </w:p>
+    <w:p>
+      <w:pPr>
+        <w:pStyle w:val="PargrafodaLista"/>
+        <w:numPr>
+          <w:ilvl w:val="0"/>
+          <w:numId w:val="24"/>
+        </w:numPr>
+        <w:jc w:val="both"/>
+      </w:pPr>
+      <w:r>
+        <w:t>Links de navegação direta para os</w:t>
+      </w:r>
+      <w:r>
+        <w:t xml:space="preserve"> </w:t>
+      </w:r>
+      <w:r>
+        <w:t>entregáveis complementares</w:t>
+      </w:r>
+      <w:r>
+        <w:t xml:space="preserve"> </w:t>
+      </w:r>
+      <w:r>
+        <w:t>(</w:t>
+      </w:r>
+      <w:r>
+        <w:rPr>
+          <w:i/>
+          <w:iCs/>
+        </w:rPr>
+        <w:t>dashboard_uml.html</w:t>
+      </w:r>
+      <w:r>
+        <w:t xml:space="preserve"> e </w:t>
+      </w:r>
+      <w:r>
+        <w:rPr>
+          <w:i/>
+          <w:iCs/>
+        </w:rPr>
+        <w:t>insights_uml.html</w:t>
+      </w:r>
+      <w:r>
+        <w:t>).</w:t>
+      </w:r>
+    </w:p>
+    <w:p>
+      <w:pPr>
+        <w:jc w:val="both"/>
+      </w:pPr>
+    </w:p>
+    <w:p>
+      <w:pPr>
+        <w:ind w:firstLine="708"/>
+        <w:jc w:val="both"/>
+      </w:pPr>
+      <w:r>
+        <w:t>A visualização interativa do arquivo resumo_executivo.html está disponível no link</w:t>
+      </w:r>
+      <w:r>
+        <w:t xml:space="preserve"> </w:t>
+      </w:r>
+      <w:hyperlink r:id="rId12" w:history="1">
+        <w:r>
+          <w:rPr>
+            <w:rStyle w:val="Hyperlink"/>
+          </w:rPr>
+          <w:t>https://github.com/MarcosStingher/marcosstingher_tcc2/blob/main/resumo_executivo.html</w:t>
+        </w:r>
+      </w:hyperlink>
+      <w:r>
+        <w:t>.</w:t>
+      </w:r>
+    </w:p>
+    <w:p>
+      <w:pPr>
+        <w:ind w:firstLine="708"/>
+        <w:jc w:val="both"/>
+      </w:pPr>
+      <w:r>
         <w:t>A integração entre o processamento em Python e a geração dos dashboards garante que qualquer atualização do corpus (adição de novos artigos, correção de metadados) seja propagada automaticamente aos artefatos visuais, tornando o trabalho reproduzível.</w:t>
       </w:r>
     </w:p>
@@ -13146,6 +13319,7 @@
         <w:rPr>
           <w:bCs/>
         </w:rPr>
+        <w:lastRenderedPageBreak/>
         <w:t>4.</w:t>
       </w:r>
       <w:r>
@@ -13326,7 +13500,6 @@
           <w:b/>
           <w:bCs/>
         </w:rPr>
-        <w:lastRenderedPageBreak/>
         <w:t xml:space="preserve">QS2 </w:t>
       </w:r>
       <w:r>
@@ -13511,7 +13684,11 @@
         <w:t>experimentais</w:t>
       </w:r>
       <w:r>
-        <w:t xml:space="preserve"> e pesquisas sobre ferramentas CASE. A Fase 2 (2015–2019) marca a transição para o MDE: a comunidade passa a investigar transformações de modelos e automação do desenvolvimento. A Fase 3 (2020–2024) representa a especialização: a UML é investigada como plataforma de extensão para domínios específicos, como privacidade, segurança, educação, sistemas automotivos. Essa trajetória é confirmada pela análise de </w:t>
+        <w:t xml:space="preserve"> e pesquisas sobre </w:t>
+      </w:r>
+      <w:r>
+        <w:lastRenderedPageBreak/>
+        <w:t xml:space="preserve">ferramentas CASE. A Fase 2 (2015–2019) marca a transição para o MDE: a comunidade passa a investigar transformações de modelos e automação do desenvolvimento. A Fase 3 (2020–2024) representa a especialização: a UML é investigada como plataforma de extensão para domínios específicos, como privacidade, segurança, educação, sistemas automotivos. Essa trajetória é confirmada pela análise de </w:t>
       </w:r>
       <w:proofErr w:type="spellStart"/>
       <w:r>
@@ -13597,38 +13774,30 @@
         <w:t>modificação no modo como a UML é utilizada</w:t>
       </w:r>
       <w:r>
-        <w:t xml:space="preserve">. Em relação ao MDE, a UML passou de linguagem de especificação manual para ponto de partida de pipelines de transformação automática, um posicionamento que amplia seu papel, mas também exige extensões e perfis de domínio que a própria especificação UML prevê. Em relação ao desenvolvimento ágil, a UML é cada vez mais adotada como ferramenta de comunicação informal e seletiva, não como especificação formal. Esse padrão, corroborado por </w:t>
+        <w:t xml:space="preserve">. Em relação ao MDE, a UML passou de linguagem de especificação manual para ponto de partida de pipelines de transformação automática, um posicionamento que amplia seu papel, mas também exige extensões e perfis de domínio que a própria especificação UML prevê. Em relação ao desenvolvimento ágil, a UML é cada vez mais adotada como ferramenta de comunicação informal e seletiva, não como especificação formal. Esse padrão, corroborado por Petre (2013), </w:t>
       </w:r>
       <w:proofErr w:type="spellStart"/>
       <w:r>
-        <w:t>Petre</w:t>
+        <w:t>Badreddin</w:t>
       </w:r>
       <w:proofErr w:type="spellEnd"/>
       <w:r>
-        <w:t xml:space="preserve"> (2013), </w:t>
+        <w:t xml:space="preserve"> et al. (2018) e </w:t>
       </w:r>
       <w:proofErr w:type="spellStart"/>
       <w:r>
-        <w:t>Badreddin</w:t>
+        <w:t>Federici</w:t>
       </w:r>
       <w:proofErr w:type="spellEnd"/>
       <w:r>
-        <w:t xml:space="preserve"> et al. (2018) e </w:t>
+        <w:t xml:space="preserve"> e </w:t>
       </w:r>
       <w:proofErr w:type="spellStart"/>
       <w:r>
-        <w:t>Federici</w:t>
+        <w:t>Kruchten</w:t>
       </w:r>
       <w:proofErr w:type="spellEnd"/>
       <w:r>
-        <w:t xml:space="preserve"> e </w:t>
-      </w:r>
-      <w:proofErr w:type="spellStart"/>
-      <w:r>
-        <w:t>Kruchten</w:t>
-      </w:r>
-      <w:proofErr w:type="spellEnd"/>
-      <w:r>
         <w:t xml:space="preserve"> (2021), indica que a UML mantém relevância prática, mas </w:t>
       </w:r>
       <w:r>
@@ -13641,11 +13810,7 @@
         <w:t>a</w:t>
       </w:r>
       <w:r>
-        <w:t xml:space="preserve">o originalmente concebido: não </w:t>
-      </w:r>
-      <w:r>
-        <w:lastRenderedPageBreak/>
-        <w:t>como</w:t>
+        <w:t>o originalmente concebido: não como</w:t>
       </w:r>
       <w:r>
         <w:t xml:space="preserve"> um modelo engessado</w:t>
@@ -13769,6 +13934,7 @@
           <w:b/>
           <w:bCs/>
         </w:rPr>
+        <w:lastRenderedPageBreak/>
         <w:t>Limitação</w:t>
       </w:r>
       <w:r>
@@ -13891,11 +14057,7 @@
       </w:r>
       <w:proofErr w:type="spellEnd"/>
       <w:r>
-        <w:t xml:space="preserve"> de 235 registros coletados em três plataformas, e seu </w:t>
-      </w:r>
-      <w:r>
-        <w:lastRenderedPageBreak/>
-        <w:t xml:space="preserve">cumprimento </w:t>
+        <w:t xml:space="preserve"> de 235 registros coletados em três plataformas, e seu cumprimento </w:t>
       </w:r>
       <w:r>
         <w:t>auxiliou</w:t>
@@ -14001,7 +14163,11 @@
         <w:t>o</w:t>
       </w:r>
       <w:r>
-        <w:t xml:space="preserve">, foi desenvolvida e disponibilizada uma plataforma interativa de visualização, composta pelos painéis </w:t>
+        <w:t xml:space="preserve">, foi desenvolvida e disponibilizada uma plataforma interativa </w:t>
+      </w:r>
+      <w:r>
+        <w:lastRenderedPageBreak/>
+        <w:t xml:space="preserve">de visualização, composta pelos painéis </w:t>
       </w:r>
       <w:r>
         <w:rPr>
@@ -14011,7 +14177,7 @@
         <w:t>dashboard_uml.html</w:t>
       </w:r>
       <w:r>
-        <w:t xml:space="preserve"> e </w:t>
+        <w:t xml:space="preserve">, </w:t>
       </w:r>
       <w:r>
         <w:rPr>
@@ -14021,7 +14187,20 @@
         <w:t>insights_uml.html</w:t>
       </w:r>
       <w:r>
-        <w:t>, que torna o corpus acessível</w:t>
+        <w:t xml:space="preserve"> e </w:t>
+      </w:r>
+      <w:r>
+        <w:rPr>
+          <w:i/>
+          <w:iCs/>
+        </w:rPr>
+        <w:t>resumo_executivo.html</w:t>
+      </w:r>
+      <w:r>
+        <w:t>,</w:t>
+      </w:r>
+      <w:r>
+        <w:t xml:space="preserve"> que torna o corpus acessível</w:t>
       </w:r>
       <w:r>
         <w:t xml:space="preserve"> e</w:t>
@@ -14839,34 +15018,66 @@
       <w:pPr>
         <w:spacing w:line="240" w:lineRule="auto"/>
         <w:jc w:val="left"/>
-      </w:pPr>
-      <w:r>
         <w:rPr>
           <w:lang w:val="en-US"/>
         </w:rPr>
+      </w:pPr>
+      <w:r>
+        <w:rPr>
+          <w:lang w:val="en-US"/>
+        </w:rPr>
         <w:t xml:space="preserve">SAHLABADI, M. et al. LPMSAEF: lightweight process mining-based software architecture evaluation framework for security and performance analysis. </w:t>
       </w:r>
       <w:proofErr w:type="spellStart"/>
       <w:r>
+        <w:rPr>
+          <w:lang w:val="en-US"/>
+        </w:rPr>
         <w:t>Heliyon</w:t>
       </w:r>
       <w:proofErr w:type="spellEnd"/>
       <w:r>
+        <w:rPr>
+          <w:lang w:val="en-US"/>
+        </w:rPr>
         <w:t xml:space="preserve">, 2024. </w:t>
       </w:r>
       <w:proofErr w:type="spellStart"/>
       <w:r>
+        <w:rPr>
+          <w:lang w:val="en-US"/>
+        </w:rPr>
         <w:t>doi</w:t>
       </w:r>
       <w:proofErr w:type="spellEnd"/>
       <w:r>
-        <w:t>: 10.1016/j.heliyon.2024.e26969.</w:t>
+        <w:rPr>
+          <w:lang w:val="en-US"/>
+        </w:rPr>
+        <w:t xml:space="preserve">: </w:t>
+      </w:r>
+      <w:proofErr w:type="gramStart"/>
+      <w:r>
+        <w:rPr>
+          <w:lang w:val="en-US"/>
+        </w:rPr>
+        <w:t>10.1016/j.heliyon.2024.e</w:t>
+      </w:r>
+      <w:proofErr w:type="gramEnd"/>
+      <w:r>
+        <w:rPr>
+          <w:lang w:val="en-US"/>
+        </w:rPr>
+        <w:t>26969.</w:t>
       </w:r>
     </w:p>
     <w:p>
       <w:pPr>
         <w:spacing w:line="240" w:lineRule="auto"/>
         <w:jc w:val="left"/>
+        <w:rPr>
+          <w:lang w:val="en-US"/>
+        </w:rPr>
       </w:pPr>
     </w:p>
     <w:p>
@@ -14907,48 +15118,9 @@
       <w:r>
         <w:t>: 10.1145/1978802.1978807.</w:t>
       </w:r>
-      <w:r>
-        <w:br w:type="page"/>
-      </w:r>
-    </w:p>
-    <w:p>
-      <w:pPr>
-        <w:pStyle w:val="Pargrafo"/>
-        <w:spacing w:before="0" w:after="0"/>
-        <w:ind w:firstLine="0"/>
-        <w:rPr>
-          <w:b/>
-          <w:bCs/>
-        </w:rPr>
-      </w:pPr>
-      <w:r>
-        <w:rPr>
-          <w:b/>
-          <w:bCs/>
-        </w:rPr>
-        <w:lastRenderedPageBreak/>
-        <w:t>APENDICES:</w:t>
-      </w:r>
-    </w:p>
-    <w:p>
-      <w:pPr>
-        <w:pStyle w:val="Pargrafo"/>
-        <w:spacing w:before="0" w:after="0"/>
-        <w:ind w:firstLine="0"/>
-      </w:pPr>
-    </w:p>
-    <w:p>
-      <w:pPr>
-        <w:pStyle w:val="Pargrafo"/>
-        <w:spacing w:before="0" w:after="0"/>
-        <w:ind w:firstLine="0"/>
-      </w:pPr>
-      <w:r>
-        <w:t>Apresentar aqui todos os diagramas e artefatos elaborados no TCC1.</w:t>
-      </w:r>
     </w:p>
     <w:sectPr>
-      <w:headerReference w:type="default" r:id="rId10"/>
+      <w:headerReference w:type="default" r:id="rId13"/>
       <w:pgSz w:w="11906" w:h="16838"/>
       <w:pgMar w:top="1701" w:right="1134" w:bottom="1134" w:left="1701" w:header="709" w:footer="709" w:gutter="0"/>
       <w:cols w:space="708"/>
@@ -14959,7 +15131,7 @@
 </file>
 
 <file path=word/endnotes.xml><?xml version="1.0" encoding="utf-8"?>
-<w:endnotes xmlns:wpc="http://schemas.microsoft.com/office/word/2010/wordprocessingCanvas" xmlns:cx="http://schemas.microsoft.com/office/drawing/2014/chartex" xmlns:cx1="http://schemas.microsoft.com/office/drawing/2015/9/8/chartex" xmlns:cx2="http://schemas.microsoft.com/office/drawing/2015/10/21/chartex" xmlns:cx3="http://schemas.microsoft.com/office/drawing/2016/5/9/chartex" xmlns:cx4="http://schemas.microsoft.com/office/drawing/2016/5/10/chartex" xmlns:cx5="http://schemas.microsoft.com/office/drawing/2016/5/11/chartex" xmlns:cx6="http://schemas.microsoft.com/office/drawing/2016/5/12/chartex" xmlns:cx7="http://schemas.microsoft.com/office/drawing/2016/5/13/chartex" xmlns:cx8="http://schemas.microsoft.com/office/drawing/2016/5/14/chartex" xmlns:mc="http://schemas.openxmlformats.org/markup-compatibility/2006" xmlns:aink="http://schemas.microsoft.com/office/drawing/2016/ink" xmlns:am3d="http://schemas.microsoft.com/office/drawing/2017/model3d" xmlns:o="urn:schemas-microsoft-com:office:office" xmlns:r="http://schemas.openxmlformats.org/officeDocument/2006/relationships" xmlns:m="http://schemas.openxmlformats.org/officeDocument/2006/math" xmlns:v="urn:schemas-microsoft-com:vml" xmlns:wp14="http://schemas.microsoft.com/office/word/2010/wordprocessingDrawing" xmlns:wp="http://schemas.openxmlformats.org/drawingml/2006/wordprocessingDrawing" xmlns:w10="urn:schemas-microsoft-com:office:word" xmlns:w="http://schemas.openxmlformats.org/wordprocessingml/2006/main" xmlns:w14="http://schemas.microsoft.com/office/word/2010/wordml" xmlns:w15="http://schemas.microsoft.com/office/word/2012/wordml" xmlns:w16cex="http://schemas.microsoft.com/office/word/2018/wordml/cex" xmlns:w16cid="http://schemas.microsoft.com/office/word/2016/wordml/cid" xmlns:w16="http://schemas.microsoft.com/office/word/2018/wordml" xmlns:w16sdtdh="http://schemas.microsoft.com/office/word/2020/wordml/sdtdatahash" xmlns:w16se="http://schemas.microsoft.com/office/word/2015/wordml/symex" xmlns:wpg="http://schemas.microsoft.com/office/word/2010/wordprocessingGroup" xmlns:wpi="http://schemas.microsoft.com/office/word/2010/wordprocessingInk" xmlns:wne="http://schemas.microsoft.com/office/word/2006/wordml" xmlns:wps="http://schemas.microsoft.com/office/word/2010/wordprocessingShape" mc:Ignorable="w14 w15 w16se w16cid w16 w16cex w16sdtdh wp14">
+<w:endnotes xmlns:wpc="http://schemas.microsoft.com/office/word/2010/wordprocessingCanvas" xmlns:cx="http://schemas.microsoft.com/office/drawing/2014/chartex" xmlns:cx1="http://schemas.microsoft.com/office/drawing/2015/9/8/chartex" xmlns:cx2="http://schemas.microsoft.com/office/drawing/2015/10/21/chartex" xmlns:cx3="http://schemas.microsoft.com/office/drawing/2016/5/9/chartex" xmlns:cx4="http://schemas.microsoft.com/office/drawing/2016/5/10/chartex" xmlns:cx5="http://schemas.microsoft.com/office/drawing/2016/5/11/chartex" xmlns:cx6="http://schemas.microsoft.com/office/drawing/2016/5/12/chartex" xmlns:cx7="http://schemas.microsoft.com/office/drawing/2016/5/13/chartex" xmlns:cx8="http://schemas.microsoft.com/office/drawing/2016/5/14/chartex" xmlns:mc="http://schemas.openxmlformats.org/markup-compatibility/2006" xmlns:aink="http://schemas.microsoft.com/office/drawing/2016/ink" xmlns:am3d="http://schemas.microsoft.com/office/drawing/2017/model3d" xmlns:o="urn:schemas-microsoft-com:office:office" xmlns:oel="http://schemas.microsoft.com/office/2019/extlst" xmlns:r="http://schemas.openxmlformats.org/officeDocument/2006/relationships" xmlns:m="http://schemas.openxmlformats.org/officeDocument/2006/math" xmlns:v="urn:schemas-microsoft-com:vml" xmlns:wp14="http://schemas.microsoft.com/office/word/2010/wordprocessingDrawing" xmlns:wp="http://schemas.openxmlformats.org/drawingml/2006/wordprocessingDrawing" xmlns:w10="urn:schemas-microsoft-com:office:word" xmlns:w="http://schemas.openxmlformats.org/wordprocessingml/2006/main" xmlns:w14="http://schemas.microsoft.com/office/word/2010/wordml" xmlns:w15="http://schemas.microsoft.com/office/word/2012/wordml" xmlns:w16cex="http://schemas.microsoft.com/office/word/2018/wordml/cex" xmlns:w16cid="http://schemas.microsoft.com/office/word/2016/wordml/cid" xmlns:w16="http://schemas.microsoft.com/office/word/2018/wordml" xmlns:w16du="http://schemas.microsoft.com/office/word/2023/wordml/word16du" xmlns:w16sdtdh="http://schemas.microsoft.com/office/word/2020/wordml/sdtdatahash" xmlns:w16sdtfl="http://schemas.microsoft.com/office/word/2024/wordml/sdtformatlock" xmlns:w16se="http://schemas.microsoft.com/office/word/2015/wordml/symex" xmlns:wpg="http://schemas.microsoft.com/office/word/2010/wordprocessingGroup" xmlns:wpi="http://schemas.microsoft.com/office/word/2010/wordprocessingInk" xmlns:wne="http://schemas.microsoft.com/office/word/2006/wordml" xmlns:wps="http://schemas.microsoft.com/office/word/2010/wordprocessingShape" mc:Ignorable="w14 w15 w16se w16cid w16 w16cex w16sdtdh w16sdtfl w16du wp14">
   <w:endnote w:type="separator" w:id="-1">
     <w:p>
       <w:pPr>
@@ -14984,7 +15156,7 @@
 </file>
 
 <file path=word/footnotes.xml><?xml version="1.0" encoding="utf-8"?>
-<w:footnotes xmlns:wpc="http://schemas.microsoft.com/office/word/2010/wordprocessingCanvas" xmlns:cx="http://schemas.microsoft.com/office/drawing/2014/chartex" xmlns:cx1="http://schemas.microsoft.com/office/drawing/2015/9/8/chartex" xmlns:cx2="http://schemas.microsoft.com/office/drawing/2015/10/21/chartex" xmlns:cx3="http://schemas.microsoft.com/office/drawing/2016/5/9/chartex" xmlns:cx4="http://schemas.microsoft.com/office/drawing/2016/5/10/chartex" xmlns:cx5="http://schemas.microsoft.com/office/drawing/2016/5/11/chartex" xmlns:cx6="http://schemas.microsoft.com/office/drawing/2016/5/12/chartex" xmlns:cx7="http://schemas.microsoft.com/office/drawing/2016/5/13/chartex" xmlns:cx8="http://schemas.microsoft.com/office/drawing/2016/5/14/chartex" xmlns:mc="http://schemas.openxmlformats.org/markup-compatibility/2006" xmlns:aink="http://schemas.microsoft.com/office/drawing/2016/ink" xmlns:am3d="http://schemas.microsoft.com/office/drawing/2017/model3d" xmlns:o="urn:schemas-microsoft-com:office:office" xmlns:r="http://schemas.openxmlformats.org/officeDocument/2006/relationships" xmlns:m="http://schemas.openxmlformats.org/officeDocument/2006/math" xmlns:v="urn:schemas-microsoft-com:vml" xmlns:wp14="http://schemas.microsoft.com/office/word/2010/wordprocessingDrawing" xmlns:wp="http://schemas.openxmlformats.org/drawingml/2006/wordprocessingDrawing" xmlns:w10="urn:schemas-microsoft-com:office:word" xmlns:w="http://schemas.openxmlformats.org/wordprocessingml/2006/main" xmlns:w14="http://schemas.microsoft.com/office/word/2010/wordml" xmlns:w15="http://schemas.microsoft.com/office/word/2012/wordml" xmlns:w16cex="http://schemas.microsoft.com/office/word/2018/wordml/cex" xmlns:w16cid="http://schemas.microsoft.com/office/word/2016/wordml/cid" xmlns:w16="http://schemas.microsoft.com/office/word/2018/wordml" xmlns:w16sdtdh="http://schemas.microsoft.com/office/word/2020/wordml/sdtdatahash" xmlns:w16se="http://schemas.microsoft.com/office/word/2015/wordml/symex" xmlns:wpg="http://schemas.microsoft.com/office/word/2010/wordprocessingGroup" xmlns:wpi="http://schemas.microsoft.com/office/word/2010/wordprocessingInk" xmlns:wne="http://schemas.microsoft.com/office/word/2006/wordml" xmlns:wps="http://schemas.microsoft.com/office/word/2010/wordprocessingShape" mc:Ignorable="w14 w15 w16se w16cid w16 w16cex w16sdtdh wp14">
+<w:footnotes xmlns:wpc="http://schemas.microsoft.com/office/word/2010/wordprocessingCanvas" xmlns:cx="http://schemas.microsoft.com/office/drawing/2014/chartex" xmlns:cx1="http://schemas.microsoft.com/office/drawing/2015/9/8/chartex" xmlns:cx2="http://schemas.microsoft.com/office/drawing/2015/10/21/chartex" xmlns:cx3="http://schemas.microsoft.com/office/drawing/2016/5/9/chartex" xmlns:cx4="http://schemas.microsoft.com/office/drawing/2016/5/10/chartex" xmlns:cx5="http://schemas.microsoft.com/office/drawing/2016/5/11/chartex" xmlns:cx6="http://schemas.microsoft.com/office/drawing/2016/5/12/chartex" xmlns:cx7="http://schemas.microsoft.com/office/drawing/2016/5/13/chartex" xmlns:cx8="http://schemas.microsoft.com/office/drawing/2016/5/14/chartex" xmlns:mc="http://schemas.openxmlformats.org/markup-compatibility/2006" xmlns:aink="http://schemas.microsoft.com/office/drawing/2016/ink" xmlns:am3d="http://schemas.microsoft.com/office/drawing/2017/model3d" xmlns:o="urn:schemas-microsoft-com:office:office" xmlns:oel="http://schemas.microsoft.com/office/2019/extlst" xmlns:r="http://schemas.openxmlformats.org/officeDocument/2006/relationships" xmlns:m="http://schemas.openxmlformats.org/officeDocument/2006/math" xmlns:v="urn:schemas-microsoft-com:vml" xmlns:wp14="http://schemas.microsoft.com/office/word/2010/wordprocessingDrawing" xmlns:wp="http://schemas.openxmlformats.org/drawingml/2006/wordprocessingDrawing" xmlns:w10="urn:schemas-microsoft-com:office:word" xmlns:w="http://schemas.openxmlformats.org/wordprocessingml/2006/main" xmlns:w14="http://schemas.microsoft.com/office/word/2010/wordml" xmlns:w15="http://schemas.microsoft.com/office/word/2012/wordml" xmlns:w16cex="http://schemas.microsoft.com/office/word/2018/wordml/cex" xmlns:w16cid="http://schemas.microsoft.com/office/word/2016/wordml/cid" xmlns:w16="http://schemas.microsoft.com/office/word/2018/wordml" xmlns:w16du="http://schemas.microsoft.com/office/word/2023/wordml/word16du" xmlns:w16sdtdh="http://schemas.microsoft.com/office/word/2020/wordml/sdtdatahash" xmlns:w16sdtfl="http://schemas.microsoft.com/office/word/2024/wordml/sdtformatlock" xmlns:w16se="http://schemas.microsoft.com/office/word/2015/wordml/symex" xmlns:wpg="http://schemas.microsoft.com/office/word/2010/wordprocessingGroup" xmlns:wpi="http://schemas.microsoft.com/office/word/2010/wordprocessingInk" xmlns:wne="http://schemas.microsoft.com/office/word/2006/wordml" xmlns:wps="http://schemas.microsoft.com/office/word/2010/wordprocessingShape" mc:Ignorable="w14 w15 w16se w16cid w16 w16cex w16sdtdh w16sdtfl w16du wp14">
   <w:footnote w:type="separator" w:id="-1">
     <w:p>
       <w:pPr>
@@ -15089,7 +15261,7 @@
 </file>
 
 <file path=word/header1.xml><?xml version="1.0" encoding="utf-8"?>
-<w:hdr xmlns:wpc="http://schemas.microsoft.com/office/word/2010/wordprocessingCanvas" xmlns:cx="http://schemas.microsoft.com/office/drawing/2014/chartex" xmlns:cx1="http://schemas.microsoft.com/office/drawing/2015/9/8/chartex" xmlns:cx2="http://schemas.microsoft.com/office/drawing/2015/10/21/chartex" xmlns:cx3="http://schemas.microsoft.com/office/drawing/2016/5/9/chartex" xmlns:cx4="http://schemas.microsoft.com/office/drawing/2016/5/10/chartex" xmlns:cx5="http://schemas.microsoft.com/office/drawing/2016/5/11/chartex" xmlns:cx6="http://schemas.microsoft.com/office/drawing/2016/5/12/chartex" xmlns:cx7="http://schemas.microsoft.com/office/drawing/2016/5/13/chartex" xmlns:cx8="http://schemas.microsoft.com/office/drawing/2016/5/14/chartex" xmlns:mc="http://schemas.openxmlformats.org/markup-compatibility/2006" xmlns:aink="http://schemas.microsoft.com/office/drawing/2016/ink" xmlns:am3d="http://schemas.microsoft.com/office/drawing/2017/model3d" xmlns:o="urn:schemas-microsoft-com:office:office" xmlns:r="http://schemas.openxmlformats.org/officeDocument/2006/relationships" xmlns:m="http://schemas.openxmlformats.org/officeDocument/2006/math" xmlns:v="urn:schemas-microsoft-com:vml" xmlns:wp14="http://schemas.microsoft.com/office/word/2010/wordprocessingDrawing" xmlns:wp="http://schemas.openxmlformats.org/drawingml/2006/wordprocessingDrawing" xmlns:w10="urn:schemas-microsoft-com:office:word" xmlns:w="http://schemas.openxmlformats.org/wordprocessingml/2006/main" xmlns:w14="http://schemas.microsoft.com/office/word/2010/wordml" xmlns:w15="http://schemas.microsoft.com/office/word/2012/wordml" xmlns:w16cex="http://schemas.microsoft.com/office/word/2018/wordml/cex" xmlns:w16cid="http://schemas.microsoft.com/office/word/2016/wordml/cid" xmlns:w16="http://schemas.microsoft.com/office/word/2018/wordml" xmlns:w16sdtdh="http://schemas.microsoft.com/office/word/2020/wordml/sdtdatahash" xmlns:w16se="http://schemas.microsoft.com/office/word/2015/wordml/symex" xmlns:wpg="http://schemas.microsoft.com/office/word/2010/wordprocessingGroup" xmlns:wpi="http://schemas.microsoft.com/office/word/2010/wordprocessingInk" xmlns:wne="http://schemas.microsoft.com/office/word/2006/wordml" xmlns:wps="http://schemas.microsoft.com/office/word/2010/wordprocessingShape" mc:Ignorable="w14 w15 w16se w16cid w16 w16cex w16sdtdh wp14">
+<w:hdr xmlns:wpc="http://schemas.microsoft.com/office/word/2010/wordprocessingCanvas" xmlns:cx="http://schemas.microsoft.com/office/drawing/2014/chartex" xmlns:cx1="http://schemas.microsoft.com/office/drawing/2015/9/8/chartex" xmlns:cx2="http://schemas.microsoft.com/office/drawing/2015/10/21/chartex" xmlns:cx3="http://schemas.microsoft.com/office/drawing/2016/5/9/chartex" xmlns:cx4="http://schemas.microsoft.com/office/drawing/2016/5/10/chartex" xmlns:cx5="http://schemas.microsoft.com/office/drawing/2016/5/11/chartex" xmlns:cx6="http://schemas.microsoft.com/office/drawing/2016/5/12/chartex" xmlns:cx7="http://schemas.microsoft.com/office/drawing/2016/5/13/chartex" xmlns:cx8="http://schemas.microsoft.com/office/drawing/2016/5/14/chartex" xmlns:mc="http://schemas.openxmlformats.org/markup-compatibility/2006" xmlns:aink="http://schemas.microsoft.com/office/drawing/2016/ink" xmlns:am3d="http://schemas.microsoft.com/office/drawing/2017/model3d" xmlns:o="urn:schemas-microsoft-com:office:office" xmlns:oel="http://schemas.microsoft.com/office/2019/extlst" xmlns:r="http://schemas.openxmlformats.org/officeDocument/2006/relationships" xmlns:m="http://schemas.openxmlformats.org/officeDocument/2006/math" xmlns:v="urn:schemas-microsoft-com:vml" xmlns:wp14="http://schemas.microsoft.com/office/word/2010/wordprocessingDrawing" xmlns:wp="http://schemas.openxmlformats.org/drawingml/2006/wordprocessingDrawing" xmlns:w10="urn:schemas-microsoft-com:office:word" xmlns:w="http://schemas.openxmlformats.org/wordprocessingml/2006/main" xmlns:w14="http://schemas.microsoft.com/office/word/2010/wordml" xmlns:w15="http://schemas.microsoft.com/office/word/2012/wordml" xmlns:w16cex="http://schemas.microsoft.com/office/word/2018/wordml/cex" xmlns:w16cid="http://schemas.microsoft.com/office/word/2016/wordml/cid" xmlns:w16="http://schemas.microsoft.com/office/word/2018/wordml" xmlns:w16du="http://schemas.microsoft.com/office/word/2023/wordml/word16du" xmlns:w16sdtdh="http://schemas.microsoft.com/office/word/2020/wordml/sdtdatahash" xmlns:w16sdtfl="http://schemas.microsoft.com/office/word/2024/wordml/sdtformatlock" xmlns:w16se="http://schemas.microsoft.com/office/word/2015/wordml/symex" xmlns:wpg="http://schemas.microsoft.com/office/word/2010/wordprocessingGroup" xmlns:wpi="http://schemas.microsoft.com/office/word/2010/wordprocessingInk" xmlns:wne="http://schemas.microsoft.com/office/word/2006/wordml" xmlns:wps="http://schemas.microsoft.com/office/word/2010/wordprocessingShape" mc:Ignorable="w14 w15 w16se w16cid w16 w16cex w16sdtdh w16sdtfl w16du wp14">
   <w:sdt>
     <w:sdtPr>
       <w:rPr>
@@ -15158,7 +15330,7 @@
 </file>
 
 <file path=word/numbering.xml><?xml version="1.0" encoding="utf-8"?>
-<w:numbering xmlns:wpc="http://schemas.microsoft.com/office/word/2010/wordprocessingCanvas" xmlns:cx="http://schemas.microsoft.com/office/drawing/2014/chartex" xmlns:cx1="http://schemas.microsoft.com/office/drawing/2015/9/8/chartex" xmlns:cx2="http://schemas.microsoft.com/office/drawing/2015/10/21/chartex" xmlns:cx3="http://schemas.microsoft.com/office/drawing/2016/5/9/chartex" xmlns:cx4="http://schemas.microsoft.com/office/drawing/2016/5/10/chartex" xmlns:cx5="http://schemas.microsoft.com/office/drawing/2016/5/11/chartex" xmlns:cx6="http://schemas.microsoft.com/office/drawing/2016/5/12/chartex" xmlns:cx7="http://schemas.microsoft.com/office/drawing/2016/5/13/chartex" xmlns:cx8="http://schemas.microsoft.com/office/drawing/2016/5/14/chartex" xmlns:mc="http://schemas.openxmlformats.org/markup-compatibility/2006" xmlns:aink="http://schemas.microsoft.com/office/drawing/2016/ink" xmlns:am3d="http://schemas.microsoft.com/office/drawing/2017/model3d" xmlns:o="urn:schemas-microsoft-com:office:office" xmlns:r="http://schemas.openxmlformats.org/officeDocument/2006/relationships" xmlns:m="http://schemas.openxmlformats.org/officeDocument/2006/math" xmlns:v="urn:schemas-microsoft-com:vml" xmlns:wp14="http://schemas.microsoft.com/office/word/2010/wordprocessingDrawing" xmlns:wp="http://schemas.openxmlformats.org/drawingml/2006/wordprocessingDrawing" xmlns:w10="urn:schemas-microsoft-com:office:word" xmlns:w="http://schemas.openxmlformats.org/wordprocessingml/2006/main" xmlns:w14="http://schemas.microsoft.com/office/word/2010/wordml" xmlns:w15="http://schemas.microsoft.com/office/word/2012/wordml" xmlns:w16cex="http://schemas.microsoft.com/office/word/2018/wordml/cex" xmlns:w16cid="http://schemas.microsoft.com/office/word/2016/wordml/cid" xmlns:w16="http://schemas.microsoft.com/office/word/2018/wordml" xmlns:w16sdtdh="http://schemas.microsoft.com/office/word/2020/wordml/sdtdatahash" xmlns:w16se="http://schemas.microsoft.com/office/word/2015/wordml/symex" xmlns:wpg="http://schemas.microsoft.com/office/word/2010/wordprocessingGroup" xmlns:wpi="http://schemas.microsoft.com/office/word/2010/wordprocessingInk" xmlns:wne="http://schemas.microsoft.com/office/word/2006/wordml" xmlns:wps="http://schemas.microsoft.com/office/word/2010/wordprocessingShape" mc:Ignorable="w14 w15 w16se w16cid w16 w16cex w16sdtdh wp14">
+<w:numbering xmlns:wpc="http://schemas.microsoft.com/office/word/2010/wordprocessingCanvas" xmlns:cx="http://schemas.microsoft.com/office/drawing/2014/chartex" xmlns:cx1="http://schemas.microsoft.com/office/drawing/2015/9/8/chartex" xmlns:cx2="http://schemas.microsoft.com/office/drawing/2015/10/21/chartex" xmlns:cx3="http://schemas.microsoft.com/office/drawing/2016/5/9/chartex" xmlns:cx4="http://schemas.microsoft.com/office/drawing/2016/5/10/chartex" xmlns:cx5="http://schemas.microsoft.com/office/drawing/2016/5/11/chartex" xmlns:cx6="http://schemas.microsoft.com/office/drawing/2016/5/12/chartex" xmlns:cx7="http://schemas.microsoft.com/office/drawing/2016/5/13/chartex" xmlns:cx8="http://schemas.microsoft.com/office/drawing/2016/5/14/chartex" xmlns:mc="http://schemas.openxmlformats.org/markup-compatibility/2006" xmlns:aink="http://schemas.microsoft.com/office/drawing/2016/ink" xmlns:am3d="http://schemas.microsoft.com/office/drawing/2017/model3d" xmlns:o="urn:schemas-microsoft-com:office:office" xmlns:oel="http://schemas.microsoft.com/office/2019/extlst" xmlns:r="http://schemas.openxmlformats.org/officeDocument/2006/relationships" xmlns:m="http://schemas.openxmlformats.org/officeDocument/2006/math" xmlns:v="urn:schemas-microsoft-com:vml" xmlns:wp14="http://schemas.microsoft.com/office/word/2010/wordprocessingDrawing" xmlns:wp="http://schemas.openxmlformats.org/drawingml/2006/wordprocessingDrawing" xmlns:w10="urn:schemas-microsoft-com:office:word" xmlns:w="http://schemas.openxmlformats.org/wordprocessingml/2006/main" xmlns:w14="http://schemas.microsoft.com/office/word/2010/wordml" xmlns:w15="http://schemas.microsoft.com/office/word/2012/wordml" xmlns:w16cex="http://schemas.microsoft.com/office/word/2018/wordml/cex" xmlns:w16cid="http://schemas.microsoft.com/office/word/2016/wordml/cid" xmlns:w16="http://schemas.microsoft.com/office/word/2018/wordml" xmlns:w16du="http://schemas.microsoft.com/office/word/2023/wordml/word16du" xmlns:w16sdtdh="http://schemas.microsoft.com/office/word/2020/wordml/sdtdatahash" xmlns:w16sdtfl="http://schemas.microsoft.com/office/word/2024/wordml/sdtformatlock" xmlns:w16se="http://schemas.microsoft.com/office/word/2015/wordml/symex" xmlns:wpg="http://schemas.microsoft.com/office/word/2010/wordprocessingGroup" xmlns:wpi="http://schemas.microsoft.com/office/word/2010/wordprocessingInk" xmlns:wne="http://schemas.microsoft.com/office/word/2006/wordml" xmlns:wps="http://schemas.microsoft.com/office/word/2010/wordprocessingShape" mc:Ignorable="w14 w15 w16se w16cid w16 w16cex w16sdtdh w16sdtfl w16du wp14">
   <w:abstractNum w:abstractNumId="0" w15:restartNumberingAfterBreak="0">
     <w:nsid w:val="FFFFFF7C"/>
     <w:multiLevelType w:val="singleLevel"/>
@@ -15633,16 +15805,16 @@
     </w:lvl>
   </w:abstractNum>
   <w:abstractNum w:abstractNumId="13" w15:restartNumberingAfterBreak="0">
-    <w:nsid w:val="3A0A5D5E"/>
+    <w:nsid w:val="3485121B"/>
     <w:multiLevelType w:val="hybridMultilevel"/>
-    <w:tmpl w:val="4140BB3C"/>
+    <w:tmpl w:val="B308F052"/>
     <w:lvl w:ilvl="0" w:tplc="04160001">
       <w:start w:val="1"/>
       <w:numFmt w:val="bullet"/>
       <w:lvlText w:val=""/>
       <w:lvlJc w:val="left"/>
       <w:pPr>
-        <w:ind w:left="1776" w:hanging="360"/>
+        <w:ind w:left="1428" w:hanging="360"/>
       </w:pPr>
       <w:rPr>
         <w:rFonts w:ascii="Symbol" w:hAnsi="Symbol" w:hint="default"/>
@@ -15654,6 +15826,119 @@
       <w:lvlText w:val="o"/>
       <w:lvlJc w:val="left"/>
       <w:pPr>
+        <w:ind w:left="2148" w:hanging="360"/>
+      </w:pPr>
+      <w:rPr>
+        <w:rFonts w:ascii="Courier New" w:hAnsi="Courier New" w:cs="Courier New" w:hint="default"/>
+      </w:rPr>
+    </w:lvl>
+    <w:lvl w:ilvl="2" w:tplc="04160005" w:tentative="1">
+      <w:start w:val="1"/>
+      <w:numFmt w:val="bullet"/>
+      <w:lvlText w:val=""/>
+      <w:lvlJc w:val="left"/>
+      <w:pPr>
+        <w:ind w:left="2868" w:hanging="360"/>
+      </w:pPr>
+      <w:rPr>
+        <w:rFonts w:ascii="Wingdings" w:hAnsi="Wingdings" w:hint="default"/>
+      </w:rPr>
+    </w:lvl>
+    <w:lvl w:ilvl="3" w:tplc="04160001" w:tentative="1">
+      <w:start w:val="1"/>
+      <w:numFmt w:val="bullet"/>
+      <w:lvlText w:val=""/>
+      <w:lvlJc w:val="left"/>
+      <w:pPr>
+        <w:ind w:left="3588" w:hanging="360"/>
+      </w:pPr>
+      <w:rPr>
+        <w:rFonts w:ascii="Symbol" w:hAnsi="Symbol" w:hint="default"/>
+      </w:rPr>
+    </w:lvl>
+    <w:lvl w:ilvl="4" w:tplc="04160003" w:tentative="1">
+      <w:start w:val="1"/>
+      <w:numFmt w:val="bullet"/>
+      <w:lvlText w:val="o"/>
+      <w:lvlJc w:val="left"/>
+      <w:pPr>
+        <w:ind w:left="4308" w:hanging="360"/>
+      </w:pPr>
+      <w:rPr>
+        <w:rFonts w:ascii="Courier New" w:hAnsi="Courier New" w:cs="Courier New" w:hint="default"/>
+      </w:rPr>
+    </w:lvl>
+    <w:lvl w:ilvl="5" w:tplc="04160005" w:tentative="1">
+      <w:start w:val="1"/>
+      <w:numFmt w:val="bullet"/>
+      <w:lvlText w:val=""/>
+      <w:lvlJc w:val="left"/>
+      <w:pPr>
+        <w:ind w:left="5028" w:hanging="360"/>
+      </w:pPr>
+      <w:rPr>
+        <w:rFonts w:ascii="Wingdings" w:hAnsi="Wingdings" w:hint="default"/>
+      </w:rPr>
+    </w:lvl>
+    <w:lvl w:ilvl="6" w:tplc="04160001" w:tentative="1">
+      <w:start w:val="1"/>
+      <w:numFmt w:val="bullet"/>
+      <w:lvlText w:val=""/>
+      <w:lvlJc w:val="left"/>
+      <w:pPr>
+        <w:ind w:left="5748" w:hanging="360"/>
+      </w:pPr>
+      <w:rPr>
+        <w:rFonts w:ascii="Symbol" w:hAnsi="Symbol" w:hint="default"/>
+      </w:rPr>
+    </w:lvl>
+    <w:lvl w:ilvl="7" w:tplc="04160003" w:tentative="1">
+      <w:start w:val="1"/>
+      <w:numFmt w:val="bullet"/>
+      <w:lvlText w:val="o"/>
+      <w:lvlJc w:val="left"/>
+      <w:pPr>
+        <w:ind w:left="6468" w:hanging="360"/>
+      </w:pPr>
+      <w:rPr>
+        <w:rFonts w:ascii="Courier New" w:hAnsi="Courier New" w:cs="Courier New" w:hint="default"/>
+      </w:rPr>
+    </w:lvl>
+    <w:lvl w:ilvl="8" w:tplc="04160005" w:tentative="1">
+      <w:start w:val="1"/>
+      <w:numFmt w:val="bullet"/>
+      <w:lvlText w:val=""/>
+      <w:lvlJc w:val="left"/>
+      <w:pPr>
+        <w:ind w:left="7188" w:hanging="360"/>
+      </w:pPr>
+      <w:rPr>
+        <w:rFonts w:ascii="Wingdings" w:hAnsi="Wingdings" w:hint="default"/>
+      </w:rPr>
+    </w:lvl>
+  </w:abstractNum>
+  <w:abstractNum w:abstractNumId="14" w15:restartNumberingAfterBreak="0">
+    <w:nsid w:val="3A0A5D5E"/>
+    <w:multiLevelType w:val="hybridMultilevel"/>
+    <w:tmpl w:val="4140BB3C"/>
+    <w:lvl w:ilvl="0" w:tplc="04160001">
+      <w:start w:val="1"/>
+      <w:numFmt w:val="bullet"/>
+      <w:lvlText w:val=""/>
+      <w:lvlJc w:val="left"/>
+      <w:pPr>
+        <w:ind w:left="1776" w:hanging="360"/>
+      </w:pPr>
+      <w:rPr>
+        <w:rFonts w:ascii="Symbol" w:hAnsi="Symbol" w:hint="default"/>
+      </w:rPr>
+    </w:lvl>
+    <w:lvl w:ilvl="1" w:tplc="04160003" w:tentative="1">
+      <w:start w:val="1"/>
+      <w:numFmt w:val="bullet"/>
+      <w:lvlText w:val="o"/>
+      <w:lvlJc w:val="left"/>
+      <w:pPr>
         <w:ind w:left="2496" w:hanging="360"/>
       </w:pPr>
       <w:rPr>
@@ -15745,7 +16030,7 @@
       </w:rPr>
     </w:lvl>
   </w:abstractNum>
-  <w:abstractNum w:abstractNumId="14" w15:restartNumberingAfterBreak="0">
+  <w:abstractNum w:abstractNumId="15" w15:restartNumberingAfterBreak="0">
     <w:nsid w:val="3BDF16F7"/>
     <w:multiLevelType w:val="hybridMultilevel"/>
     <w:tmpl w:val="6D864604"/>
@@ -15858,7 +16143,7 @@
       </w:rPr>
     </w:lvl>
   </w:abstractNum>
-  <w:abstractNum w:abstractNumId="15" w15:restartNumberingAfterBreak="0">
+  <w:abstractNum w:abstractNumId="16" w15:restartNumberingAfterBreak="0">
     <w:nsid w:val="41E1186E"/>
     <w:multiLevelType w:val="hybridMultilevel"/>
     <w:tmpl w:val="ED42858E"/>
@@ -15971,7 +16256,7 @@
       </w:rPr>
     </w:lvl>
   </w:abstractNum>
-  <w:abstractNum w:abstractNumId="16" w15:restartNumberingAfterBreak="0">
+  <w:abstractNum w:abstractNumId="17" w15:restartNumberingAfterBreak="0">
     <w:nsid w:val="44565FCC"/>
     <w:multiLevelType w:val="hybridMultilevel"/>
     <w:tmpl w:val="D934248E"/>
@@ -16057,7 +16342,7 @@
       </w:pPr>
     </w:lvl>
   </w:abstractNum>
-  <w:abstractNum w:abstractNumId="17" w15:restartNumberingAfterBreak="0">
+  <w:abstractNum w:abstractNumId="18" w15:restartNumberingAfterBreak="0">
     <w:nsid w:val="52845C80"/>
     <w:multiLevelType w:val="hybridMultilevel"/>
     <w:tmpl w:val="E17CF734"/>
@@ -16170,7 +16455,7 @@
       </w:rPr>
     </w:lvl>
   </w:abstractNum>
-  <w:abstractNum w:abstractNumId="18" w15:restartNumberingAfterBreak="0">
+  <w:abstractNum w:abstractNumId="19" w15:restartNumberingAfterBreak="0">
     <w:nsid w:val="55376C1E"/>
     <w:multiLevelType w:val="hybridMultilevel"/>
     <w:tmpl w:val="2FEAB4B6"/>
@@ -16283,7 +16568,7 @@
       </w:rPr>
     </w:lvl>
   </w:abstractNum>
-  <w:abstractNum w:abstractNumId="19" w15:restartNumberingAfterBreak="0">
+  <w:abstractNum w:abstractNumId="20" w15:restartNumberingAfterBreak="0">
     <w:nsid w:val="5BE35E21"/>
     <w:multiLevelType w:val="hybridMultilevel"/>
     <w:tmpl w:val="E526A6A0"/>
@@ -16396,7 +16681,7 @@
       </w:rPr>
     </w:lvl>
   </w:abstractNum>
-  <w:abstractNum w:abstractNumId="20" w15:restartNumberingAfterBreak="0">
+  <w:abstractNum w:abstractNumId="21" w15:restartNumberingAfterBreak="0">
     <w:nsid w:val="63440691"/>
     <w:multiLevelType w:val="multilevel"/>
     <w:tmpl w:val="8AC639E0"/>
@@ -16518,7 +16803,7 @@
       </w:rPr>
     </w:lvl>
   </w:abstractNum>
-  <w:abstractNum w:abstractNumId="21" w15:restartNumberingAfterBreak="0">
+  <w:abstractNum w:abstractNumId="22" w15:restartNumberingAfterBreak="0">
     <w:nsid w:val="66F46EDF"/>
     <w:multiLevelType w:val="hybridMultilevel"/>
     <w:tmpl w:val="4454B630"/>
@@ -16631,80 +16916,83 @@
       </w:rPr>
     </w:lvl>
   </w:abstractNum>
-  <w:num w:numId="1">
+  <w:num w:numId="1" w16cid:durableId="1888420057">
+    <w:abstractNumId w:val="21"/>
+  </w:num>
+  <w:num w:numId="2" w16cid:durableId="455636548">
+    <w:abstractNumId w:val="21"/>
+  </w:num>
+  <w:num w:numId="3" w16cid:durableId="1995834044">
+    <w:abstractNumId w:val="17"/>
+  </w:num>
+  <w:num w:numId="4" w16cid:durableId="1996689435">
+    <w:abstractNumId w:val="9"/>
+  </w:num>
+  <w:num w:numId="5" w16cid:durableId="217595536">
+    <w:abstractNumId w:val="7"/>
+  </w:num>
+  <w:num w:numId="6" w16cid:durableId="1556813911">
+    <w:abstractNumId w:val="6"/>
+  </w:num>
+  <w:num w:numId="7" w16cid:durableId="659771247">
+    <w:abstractNumId w:val="5"/>
+  </w:num>
+  <w:num w:numId="8" w16cid:durableId="392776671">
+    <w:abstractNumId w:val="4"/>
+  </w:num>
+  <w:num w:numId="9" w16cid:durableId="759642860">
+    <w:abstractNumId w:val="8"/>
+  </w:num>
+  <w:num w:numId="10" w16cid:durableId="1757290774">
+    <w:abstractNumId w:val="3"/>
+  </w:num>
+  <w:num w:numId="11" w16cid:durableId="1083572336">
+    <w:abstractNumId w:val="2"/>
+  </w:num>
+  <w:num w:numId="12" w16cid:durableId="1195071484">
+    <w:abstractNumId w:val="1"/>
+  </w:num>
+  <w:num w:numId="13" w16cid:durableId="518473746">
+    <w:abstractNumId w:val="0"/>
+  </w:num>
+  <w:num w:numId="14" w16cid:durableId="1524661870">
+    <w:abstractNumId w:val="10"/>
+  </w:num>
+  <w:num w:numId="15" w16cid:durableId="81268294">
+    <w:abstractNumId w:val="15"/>
+  </w:num>
+  <w:num w:numId="16" w16cid:durableId="321274186">
+    <w:abstractNumId w:val="11"/>
+  </w:num>
+  <w:num w:numId="17" w16cid:durableId="1243760194">
+    <w:abstractNumId w:val="12"/>
+  </w:num>
+  <w:num w:numId="18" w16cid:durableId="1240138638">
+    <w:abstractNumId w:val="22"/>
+  </w:num>
+  <w:num w:numId="19" w16cid:durableId="669404515">
+    <w:abstractNumId w:val="16"/>
+  </w:num>
+  <w:num w:numId="20" w16cid:durableId="1423337262">
+    <w:abstractNumId w:val="14"/>
+  </w:num>
+  <w:num w:numId="21" w16cid:durableId="2060939103">
     <w:abstractNumId w:val="20"/>
   </w:num>
-  <w:num w:numId="2">
-    <w:abstractNumId w:val="20"/>
-  </w:num>
-  <w:num w:numId="3">
-    <w:abstractNumId w:val="16"/>
-  </w:num>
-  <w:num w:numId="4">
-    <w:abstractNumId w:val="9"/>
-  </w:num>
-  <w:num w:numId="5">
-    <w:abstractNumId w:val="7"/>
-  </w:num>
-  <w:num w:numId="6">
-    <w:abstractNumId w:val="6"/>
-  </w:num>
-  <w:num w:numId="7">
-    <w:abstractNumId w:val="5"/>
-  </w:num>
-  <w:num w:numId="8">
-    <w:abstractNumId w:val="4"/>
-  </w:num>
-  <w:num w:numId="9">
-    <w:abstractNumId w:val="8"/>
-  </w:num>
-  <w:num w:numId="10">
-    <w:abstractNumId w:val="3"/>
-  </w:num>
-  <w:num w:numId="11">
-    <w:abstractNumId w:val="2"/>
-  </w:num>
-  <w:num w:numId="12">
-    <w:abstractNumId w:val="1"/>
-  </w:num>
-  <w:num w:numId="13">
-    <w:abstractNumId w:val="0"/>
-  </w:num>
-  <w:num w:numId="14">
-    <w:abstractNumId w:val="10"/>
-  </w:num>
-  <w:num w:numId="15">
-    <w:abstractNumId w:val="14"/>
-  </w:num>
-  <w:num w:numId="16">
-    <w:abstractNumId w:val="11"/>
-  </w:num>
-  <w:num w:numId="17">
-    <w:abstractNumId w:val="12"/>
-  </w:num>
-  <w:num w:numId="18">
-    <w:abstractNumId w:val="21"/>
-  </w:num>
-  <w:num w:numId="19">
-    <w:abstractNumId w:val="15"/>
-  </w:num>
-  <w:num w:numId="20">
-    <w:abstractNumId w:val="13"/>
-  </w:num>
-  <w:num w:numId="21">
+  <w:num w:numId="22" w16cid:durableId="218395725">
     <w:abstractNumId w:val="19"/>
   </w:num>
-  <w:num w:numId="22">
+  <w:num w:numId="23" w16cid:durableId="1168863956">
     <w:abstractNumId w:val="18"/>
   </w:num>
-  <w:num w:numId="23">
-    <w:abstractNumId w:val="17"/>
+  <w:num w:numId="24" w16cid:durableId="49889538">
+    <w:abstractNumId w:val="13"/>
   </w:num>
 </w:numbering>
 </file>
 
 <file path=word/styles.xml><?xml version="1.0" encoding="utf-8"?>
-<w:styles xmlns:mc="http://schemas.openxmlformats.org/markup-compatibility/2006" xmlns:r="http://schemas.openxmlformats.org/officeDocument/2006/relationships" xmlns:w="http://schemas.openxmlformats.org/wordprocessingml/2006/main" xmlns:w14="http://schemas.microsoft.com/office/word/2010/wordml" xmlns:w15="http://schemas.microsoft.com/office/word/2012/wordml" xmlns:w16cex="http://schemas.microsoft.com/office/word/2018/wordml/cex" xmlns:w16cid="http://schemas.microsoft.com/office/word/2016/wordml/cid" xmlns:w16="http://schemas.microsoft.com/office/word/2018/wordml" xmlns:w16sdtdh="http://schemas.microsoft.com/office/word/2020/wordml/sdtdatahash" xmlns:w16se="http://schemas.microsoft.com/office/word/2015/wordml/symex" mc:Ignorable="w14 w15 w16se w16cid w16 w16cex w16sdtdh">
+<w:styles xmlns:mc="http://schemas.openxmlformats.org/markup-compatibility/2006" xmlns:r="http://schemas.openxmlformats.org/officeDocument/2006/relationships" xmlns:w="http://schemas.openxmlformats.org/wordprocessingml/2006/main" xmlns:w14="http://schemas.microsoft.com/office/word/2010/wordml" xmlns:w15="http://schemas.microsoft.com/office/word/2012/wordml" xmlns:w16cex="http://schemas.microsoft.com/office/word/2018/wordml/cex" xmlns:w16cid="http://schemas.microsoft.com/office/word/2016/wordml/cid" xmlns:w16="http://schemas.microsoft.com/office/word/2018/wordml" xmlns:w16du="http://schemas.microsoft.com/office/word/2023/wordml/word16du" xmlns:w16sdtdh="http://schemas.microsoft.com/office/word/2020/wordml/sdtdatahash" xmlns:w16sdtfl="http://schemas.microsoft.com/office/word/2024/wordml/sdtformatlock" xmlns:w16se="http://schemas.microsoft.com/office/word/2015/wordml/symex" mc:Ignorable="w14 w15 w16se w16cid w16 w16cex w16sdtdh w16sdtfl w16du">
   <w:docDefaults>
     <w:rPrDefault>
       <w:rPr>

</xml_diff>